<commit_message>
Guide du chargé d'affaires (Word et PowerPoint) et mise à jour du document de référence
- docs/Guide_Charge_Affaires_Promotion_Immobiliere.docx (22 pages) : rôle et
  circuit, parcours en 10 étapes, 31 pièces justificatives par famille, fiche
  donnée par donnée (étape de saisie, pièce, calcul, barème, point
  d'attention) pour les 29 critères et 13 alertes, données de classification
  1/W, lecture du résultat, suivi après octroi, outil Excel, check-list
  imprimable et glossaire
- docs/Guide_Charge_Affaires_Formation.pptx (16 diapositives) : support de
  formation avec notes de l'animateur
- libellés, étapes, barèmes, données décisionnelles, événements et
  périodicités exportés du code et du modèle publié (docs/_sources)
- document de référence v4 : section de vérification mise à jour (macros
  exécutées sous LibreOffice, recette Excel restante)

Co-Authored-By: Claude Opus 5.5 <noreply@anthropic.com>
Claude-Session: https://claude.ai/code/session_01Li2W9WshQNGLFvtEf7D8Zo
</commit_message>
<xml_diff>
--- a/docs/Modele_v4_Reference_Perspectives_Outil_Excel.docx
+++ b/docs/Modele_v4_Reference_Perspectives_Outil_Excel.docx
@@ -9365,7 +9365,7 @@
                 <w:sz w:val="17"/>
                 <w:szCs w:val="17"/>
               </w:rPr>
-              <w:t xml:space="preserve">Logement intermédiaire</w:t>
+              <w:t xml:space="preserve">Villas</w:t>
             </w:r>
           </w:p>
         </w:tc>
@@ -9392,7 +9392,7 @@
                 <w:sz w:val="17"/>
                 <w:szCs w:val="17"/>
               </w:rPr>
-              <w:t xml:space="preserve">−5 %</w:t>
+              <w:t xml:space="preserve">−4 %</w:t>
             </w:r>
           </w:p>
         </w:tc>
@@ -9421,7 +9421,7 @@
                 <w:sz w:val="17"/>
                 <w:szCs w:val="17"/>
               </w:rPr>
-              <w:t xml:space="preserve">Moyen-haut standing</w:t>
+              <w:t xml:space="preserve">Bureaux</w:t>
             </w:r>
           </w:p>
         </w:tc>
@@ -9443,11 +9443,11 @@
             <w:r>
               <w:rPr>
                 <w:rFonts w:ascii="Calibri" w:cs="Calibri" w:eastAsia="Calibri" w:hAnsi="Calibri"/>
-                <w:color w:val="595959"/>
-                <w:sz w:val="17"/>
-                <w:szCs w:val="17"/>
-              </w:rPr>
-              <w:t xml:space="preserve">0 %</w:t>
+                <w:color w:val="C00000"/>
+                <w:sz w:val="17"/>
+                <w:szCs w:val="17"/>
+              </w:rPr>
+              <w:t xml:space="preserve">−5 %</w:t>
             </w:r>
           </w:p>
         </w:tc>
@@ -9477,7 +9477,7 @@
                 <w:sz w:val="17"/>
                 <w:szCs w:val="17"/>
               </w:rPr>
-              <w:t xml:space="preserve">Touristique / hôtelier</w:t>
+              <w:t xml:space="preserve">Commerces</w:t>
             </w:r>
           </w:p>
         </w:tc>
@@ -9504,7 +9504,7 @@
                 <w:sz w:val="17"/>
                 <w:szCs w:val="17"/>
               </w:rPr>
-              <w:t xml:space="preserve">−7,000000000000001 %</w:t>
+              <w:t xml:space="preserve">−3 %</w:t>
             </w:r>
           </w:p>
         </w:tc>
@@ -9533,7 +9533,7 @@
                 <w:sz w:val="17"/>
                 <w:szCs w:val="17"/>
               </w:rPr>
-              <w:t xml:space="preserve">Bureaux</w:t>
+              <w:t xml:space="preserve">Moyen-haut standing</w:t>
             </w:r>
           </w:p>
         </w:tc>
@@ -9555,11 +9555,11 @@
             <w:r>
               <w:rPr>
                 <w:rFonts w:ascii="Calibri" w:cs="Calibri" w:eastAsia="Calibri" w:hAnsi="Calibri"/>
-                <w:color w:val="C00000"/>
-                <w:sz w:val="17"/>
-                <w:szCs w:val="17"/>
-              </w:rPr>
-              <w:t xml:space="preserve">−5 %</w:t>
+                <w:color w:val="595959"/>
+                <w:sz w:val="17"/>
+                <w:szCs w:val="17"/>
+              </w:rPr>
+              <w:t xml:space="preserve">0 %</w:t>
             </w:r>
           </w:p>
         </w:tc>
@@ -9589,7 +9589,7 @@
                 <w:sz w:val="17"/>
                 <w:szCs w:val="17"/>
               </w:rPr>
-              <w:t xml:space="preserve">Commerces</w:t>
+              <w:t xml:space="preserve">Touristique / hôtelier</w:t>
             </w:r>
           </w:p>
         </w:tc>
@@ -9616,7 +9616,7 @@
                 <w:sz w:val="17"/>
                 <w:szCs w:val="17"/>
               </w:rPr>
-              <w:t xml:space="preserve">−3 %</w:t>
+              <w:t xml:space="preserve">−7,000000000000001 %</w:t>
             </w:r>
           </w:p>
         </w:tc>
@@ -9645,7 +9645,7 @@
                 <w:sz w:val="17"/>
                 <w:szCs w:val="17"/>
               </w:rPr>
-              <w:t xml:space="preserve">Villas</w:t>
+              <w:t xml:space="preserve">Logement intermédiaire</w:t>
             </w:r>
           </w:p>
         </w:tc>
@@ -9671,7 +9671,7 @@
                 <w:sz w:val="17"/>
                 <w:szCs w:val="17"/>
               </w:rPr>
-              <w:t xml:space="preserve">−4 %</w:t>
+              <w:t xml:space="preserve">−5 %</w:t>
             </w:r>
           </w:p>
         </w:tc>
@@ -9792,7 +9792,7 @@
                 <w:sz w:val="17"/>
                 <w:szCs w:val="17"/>
               </w:rPr>
-              <w:t xml:space="preserve">Casablanca — centre</w:t>
+              <w:t xml:space="preserve">Agadir</w:t>
             </w:r>
           </w:p>
         </w:tc>
@@ -9848,7 +9848,7 @@
                 <w:sz w:val="17"/>
                 <w:szCs w:val="17"/>
               </w:rPr>
-              <w:t xml:space="preserve">Casablanca — périphérie</w:t>
+              <w:t xml:space="preserve">Tanger</w:t>
             </w:r>
           </w:p>
         </w:tc>
@@ -9871,11 +9871,11 @@
             <w:r>
               <w:rPr>
                 <w:rFonts w:ascii="Calibri" w:cs="Calibri" w:eastAsia="Calibri" w:hAnsi="Calibri"/>
-                <w:color w:val="C00000"/>
-                <w:sz w:val="17"/>
-                <w:szCs w:val="17"/>
-              </w:rPr>
-              <w:t xml:space="preserve">−5 %</w:t>
+                <w:color w:val="595959"/>
+                <w:sz w:val="17"/>
+                <w:szCs w:val="17"/>
+              </w:rPr>
+              <w:t xml:space="preserve">0 %</w:t>
             </w:r>
           </w:p>
         </w:tc>
@@ -9904,7 +9904,7 @@
                 <w:sz w:val="17"/>
                 <w:szCs w:val="17"/>
               </w:rPr>
-              <w:t xml:space="preserve">Rabat — centre</w:t>
+              <w:t xml:space="preserve">Marrakech</w:t>
             </w:r>
           </w:p>
         </w:tc>
@@ -9926,11 +9926,11 @@
             <w:r>
               <w:rPr>
                 <w:rFonts w:ascii="Calibri" w:cs="Calibri" w:eastAsia="Calibri" w:hAnsi="Calibri"/>
-                <w:color w:val="548235"/>
-                <w:sz w:val="17"/>
-                <w:szCs w:val="17"/>
-              </w:rPr>
-              <w:t xml:space="preserve">+2 %</w:t>
+                <w:color w:val="C00000"/>
+                <w:sz w:val="17"/>
+                <w:szCs w:val="17"/>
+              </w:rPr>
+              <w:t xml:space="preserve">−7,000000000000001 %</w:t>
             </w:r>
           </w:p>
         </w:tc>
@@ -9960,7 +9960,7 @@
                 <w:sz w:val="17"/>
                 <w:szCs w:val="17"/>
               </w:rPr>
-              <w:t xml:space="preserve">Rabat — périphérie</w:t>
+              <w:t xml:space="preserve">Casablanca — centre</w:t>
             </w:r>
           </w:p>
         </w:tc>
@@ -10016,7 +10016,7 @@
                 <w:sz w:val="17"/>
                 <w:szCs w:val="17"/>
               </w:rPr>
-              <w:t xml:space="preserve">Tanger</w:t>
+              <w:t xml:space="preserve">Fès / Oriental</w:t>
             </w:r>
           </w:p>
         </w:tc>
@@ -10038,11 +10038,11 @@
             <w:r>
               <w:rPr>
                 <w:rFonts w:ascii="Calibri" w:cs="Calibri" w:eastAsia="Calibri" w:hAnsi="Calibri"/>
-                <w:color w:val="595959"/>
-                <w:sz w:val="17"/>
-                <w:szCs w:val="17"/>
-              </w:rPr>
-              <w:t xml:space="preserve">0 %</w:t>
+                <w:color w:val="C00000"/>
+                <w:sz w:val="17"/>
+                <w:szCs w:val="17"/>
+              </w:rPr>
+              <w:t xml:space="preserve">−3 %</w:t>
             </w:r>
           </w:p>
         </w:tc>
@@ -10072,7 +10072,7 @@
                 <w:sz w:val="17"/>
                 <w:szCs w:val="17"/>
               </w:rPr>
-              <w:t xml:space="preserve">Marrakech</w:t>
+              <w:t xml:space="preserve">Rabat — centre</w:t>
             </w:r>
           </w:p>
         </w:tc>
@@ -10095,11 +10095,11 @@
             <w:r>
               <w:rPr>
                 <w:rFonts w:ascii="Calibri" w:cs="Calibri" w:eastAsia="Calibri" w:hAnsi="Calibri"/>
-                <w:color w:val="C00000"/>
-                <w:sz w:val="17"/>
-                <w:szCs w:val="17"/>
-              </w:rPr>
-              <w:t xml:space="preserve">−7,000000000000001 %</w:t>
+                <w:color w:val="548235"/>
+                <w:sz w:val="17"/>
+                <w:szCs w:val="17"/>
+              </w:rPr>
+              <w:t xml:space="preserve">+2 %</w:t>
             </w:r>
           </w:p>
         </w:tc>
@@ -10128,7 +10128,7 @@
                 <w:sz w:val="17"/>
                 <w:szCs w:val="17"/>
               </w:rPr>
-              <w:t xml:space="preserve">Agadir</w:t>
+              <w:t xml:space="preserve">Casablanca — périphérie</w:t>
             </w:r>
           </w:p>
         </w:tc>
@@ -10150,11 +10150,11 @@
             <w:r>
               <w:rPr>
                 <w:rFonts w:ascii="Calibri" w:cs="Calibri" w:eastAsia="Calibri" w:hAnsi="Calibri"/>
-                <w:color w:val="595959"/>
-                <w:sz w:val="17"/>
-                <w:szCs w:val="17"/>
-              </w:rPr>
-              <w:t xml:space="preserve">0 %</w:t>
+                <w:color w:val="C00000"/>
+                <w:sz w:val="17"/>
+                <w:szCs w:val="17"/>
+              </w:rPr>
+              <w:t xml:space="preserve">−5 %</w:t>
             </w:r>
           </w:p>
         </w:tc>
@@ -10184,7 +10184,7 @@
                 <w:sz w:val="17"/>
                 <w:szCs w:val="17"/>
               </w:rPr>
-              <w:t xml:space="preserve">Fès / Oriental</w:t>
+              <w:t xml:space="preserve">Rabat — périphérie</w:t>
             </w:r>
           </w:p>
         </w:tc>
@@ -10207,11 +10207,11 @@
             <w:r>
               <w:rPr>
                 <w:rFonts w:ascii="Calibri" w:cs="Calibri" w:eastAsia="Calibri" w:hAnsi="Calibri"/>
-                <w:color w:val="C00000"/>
-                <w:sz w:val="17"/>
-                <w:szCs w:val="17"/>
-              </w:rPr>
-              <w:t xml:space="preserve">−3 %</w:t>
+                <w:color w:val="595959"/>
+                <w:sz w:val="17"/>
+                <w:szCs w:val="17"/>
+              </w:rPr>
+              <w:t xml:space="preserve">0 %</w:t>
             </w:r>
           </w:p>
         </w:tc>
@@ -14065,7 +14065,7 @@
                 <w:sz w:val="17"/>
                 <w:szCs w:val="17"/>
               </w:rPr>
-              <w:t xml:space="preserve">Code VBA : cohérence des noms définis, feuilles, clés de données, équilibre des blocs, cibles des boutons</w:t>
+              <w:t xml:space="preserve">Formules recalculées par LibreOffice Calc (vrai tableur) sur les 20 cas de référence — outil 4.1</w:t>
             </w:r>
           </w:p>
         </w:tc>
@@ -14092,7 +14092,7 @@
                 <w:sz w:val="17"/>
                 <w:szCs w:val="17"/>
               </w:rPr>
-              <w:t xml:space="preserve">Analyse statique sans anomalie</w:t>
+              <w:t xml:space="preserve">20 / 20 identiques</w:t>
             </w:r>
           </w:p>
         </w:tc>
@@ -14122,7 +14122,7 @@
                 <w:sz w:val="17"/>
                 <w:szCs w:val="17"/>
               </w:rPr>
-              <w:t xml:space="preserve">Exécution des macros VBA dans Excel</w:t>
+              <w:t xml:space="preserve">Macros VBA exécutées sous LibreOffice (compatibilité VBA) : autotests, dossier, portefeuille, stress, validation, listes, instantané, nouveau dossier, boutons</w:t>
             </w:r>
           </w:p>
         </w:tc>
@@ -14146,11 +14146,125 @@
                 <w:rFonts w:ascii="Calibri" w:cs="Calibri" w:eastAsia="Calibri" w:hAnsi="Calibri"/>
                 <w:b/>
                 <w:bCs/>
-                <w:color w:val="C00000"/>
-                <w:sz w:val="17"/>
-                <w:szCs w:val="17"/>
-              </w:rPr>
-              <w:t xml:space="preserve">NON réalisée ici</w:t>
+                <w:color w:val="548235"/>
+                <w:sz w:val="17"/>
+                <w:szCs w:val="17"/>
+              </w:rPr>
+              <w:t xml:space="preserve">Toutes exécutées</w:t>
+            </w:r>
+          </w:p>
+        </w:tc>
+      </w:tr>
+      <w:tr>
+        <w:trPr>
+          <w:cantSplit/>
+        </w:trPr>
+        <w:tc>
+          <w:tcPr>
+            <w:tcW w:type="dxa" w:w="6300"/>
+            <w:tcMar>
+              <w:top w:type="dxa" w:w="40"/>
+              <w:left w:type="dxa" w:w="80"/>
+              <w:bottom w:type="dxa" w:w="40"/>
+              <w:right w:type="dxa" w:w="80"/>
+            </w:tcMar>
+          </w:tcPr>
+          <w:p>
+            <w:pPr>
+              <w:spacing w:after="0" w:line="240"/>
+            </w:pPr>
+            <w:r>
+              <w:rPr>
+                <w:rFonts w:ascii="Calibri" w:cs="Calibri" w:eastAsia="Calibri" w:hAnsi="Calibri"/>
+                <w:sz w:val="17"/>
+                <w:szCs w:val="17"/>
+              </w:rPr>
+              <w:t xml:space="preserve">Stress test VBA comparé au moteur de stress de l'application (7 scénarios)</w:t>
+            </w:r>
+          </w:p>
+        </w:tc>
+        <w:tc>
+          <w:tcPr>
+            <w:tcW w:type="dxa" w:w="2726"/>
+            <w:tcMar>
+              <w:top w:type="dxa" w:w="40"/>
+              <w:left w:type="dxa" w:w="80"/>
+              <w:bottom w:type="dxa" w:w="40"/>
+              <w:right w:type="dxa" w:w="80"/>
+            </w:tcMar>
+          </w:tcPr>
+          <w:p>
+            <w:pPr>
+              <w:spacing w:after="0" w:line="240"/>
+            </w:pPr>
+            <w:r>
+              <w:rPr>
+                <w:rFonts w:ascii="Calibri" w:cs="Calibri" w:eastAsia="Calibri" w:hAnsi="Calibri"/>
+                <w:b/>
+                <w:bCs/>
+                <w:color w:val="548235"/>
+                <w:sz w:val="17"/>
+                <w:szCs w:val="17"/>
+              </w:rPr>
+              <w:t xml:space="preserve">Identique</w:t>
+            </w:r>
+          </w:p>
+        </w:tc>
+      </w:tr>
+      <w:tr>
+        <w:trPr>
+          <w:cantSplit/>
+        </w:trPr>
+        <w:tc>
+          <w:tcPr>
+            <w:tcW w:type="dxa" w:w="6300"/>
+            <w:shd w:fill="F2F5FB" w:color="auto" w:val="clear"/>
+            <w:tcMar>
+              <w:top w:type="dxa" w:w="40"/>
+              <w:left w:type="dxa" w:w="80"/>
+              <w:bottom w:type="dxa" w:w="40"/>
+              <w:right w:type="dxa" w:w="80"/>
+            </w:tcMar>
+          </w:tcPr>
+          <w:p>
+            <w:pPr>
+              <w:spacing w:after="0" w:line="240"/>
+            </w:pPr>
+            <w:r>
+              <w:rPr>
+                <w:rFonts w:ascii="Calibri" w:cs="Calibri" w:eastAsia="Calibri" w:hAnsi="Calibri"/>
+                <w:sz w:val="17"/>
+                <w:szCs w:val="17"/>
+              </w:rPr>
+              <w:t xml:space="preserve">Première exécution dans Microsoft Excel</w:t>
+            </w:r>
+          </w:p>
+        </w:tc>
+        <w:tc>
+          <w:tcPr>
+            <w:tcW w:type="dxa" w:w="2726"/>
+            <w:shd w:fill="F2F5FB" w:color="auto" w:val="clear"/>
+            <w:tcMar>
+              <w:top w:type="dxa" w:w="40"/>
+              <w:left w:type="dxa" w:w="80"/>
+              <w:bottom w:type="dxa" w:w="40"/>
+              <w:right w:type="dxa" w:w="80"/>
+            </w:tcMar>
+          </w:tcPr>
+          <w:p>
+            <w:pPr>
+              <w:spacing w:after="0" w:line="240"/>
+            </w:pPr>
+            <w:r>
+              <w:rPr>
+                <w:rFonts w:ascii="Calibri" w:cs="Calibri" w:eastAsia="Calibri" w:hAnsi="Calibri"/>
+                <w:b/>
+                <w:bCs/>
+                <w:color w:val="BF8F00"/>
+                <w:sz w:val="17"/>
+                <w:szCs w:val="17"/>
+              </w:rPr>
+              <w:t xml:space="preserve">Recette à faire</w:t>
             </w:r>
           </w:p>
         </w:tc>
@@ -14165,11 +14279,11 @@
           <w:rFonts w:ascii="Calibri" w:cs="Calibri" w:eastAsia="Calibri" w:hAnsi="Calibri"/>
           <w:b/>
           <w:bCs/>
-          <w:color w:val="C00000"/>
+          <w:color w:val="548235"/>
           <w:sz w:val="21"/>
           <w:szCs w:val="21"/>
         </w:rPr>
-        <w:t xml:space="preserve">Point d'honnêteté. </w:t>
+        <w:t xml:space="preserve">Mise à jour (outil 4.1, 30 septembre 2026). </w:t>
       </w:r>
       <w:r>
         <w:rPr>
@@ -14179,7 +14293,7 @@
           <w:sz w:val="21"/>
           <w:szCs w:val="21"/>
         </w:rPr>
-        <w:t xml:space="preserve">Aucune instance d'Excel n'était disponible dans l'environnement de travail : les macros n'ont pas été exécutées. Je les ai écrites de façon conservatrice (aucune bibliothèque externe, aucun caractère accentué, gestion d'erreur avec restauration de l'état) et vérifiées statiquement, mais la première exécution réelle peut révéler une coquille de syntaxe ou un comportement propre à votre version d'Excel. C'est précisément le rôle de la macro ExecuterAutotests, à lancer en premier : elle compare le classeur aux 20 cas de référence. Si l'éditeur VBA signale une erreur à la compilation (menu Débogage → Compiler VBAProject), transmettez-moi le message : la correction est immédiate.</w:t>
+        <w:t xml:space="preserve">L'exécution réelle des macros sous LibreOffice a révélé et permis de corriger cinq défauts de l'outil 4.0 (une instruction qui empêchait la compilation du module de stress, une recherche de clé fragile, une lecture de valeur logique, une constante Excel, l'installation des boutons). LibreOffice n'étant pas Excel, la première exécution sous Excel — compilation du projet VBA puis ExecuterAutotests, attendu « 20 / 20 » — reste la recette de référence.</w:t>
       </w:r>
     </w:p>
     <w:p>

</xml_diff>